<commit_message>
Update research paper, LaTeX sources, and Springer submission docs
</commit_message>
<xml_diff>
--- a/springer_data_engineering/title_page.docx
+++ b/springer_data_engineering/title_page.docx
@@ -56,7 +56,7 @@
         <w:t xml:space="preserve"> </w:t>
       </w:r>
       <w:r>
-        <w:t xml:space="preserve">Email: shouvik.sharma@example.com</w:t>
+        <w:t xml:space="preserve">Email: shouvik.s@somaiya.edu</w:t>
       </w:r>
       <w:r>
         <w:t xml:space="preserve"> </w:t>
@@ -86,7 +86,7 @@
         <w:t xml:space="preserve"> </w:t>
       </w:r>
       <w:r>
-        <w:t xml:space="preserve">Email: shouvik.sharma@example.com</w:t>
+        <w:t xml:space="preserve">Email: shouvik.s@somaiya.edu</w:t>
       </w:r>
     </w:p>
     <w:p>

</xml_diff>